<commit_message>
Update mid-semester submission name and date
</commit_message>
<xml_diff>
--- a/deliverables/Midsem_Progress_Report_Urban_Air_Quality.docx
+++ b/deliverables/Midsem_Progress_Report_Urban_Air_Quality.docx
@@ -44,7 +44,7 @@
         <w:t xml:space="preserve">Submitted by  </w:t>
       </w:r>
       <w:r>
-        <w:t>[Student name / team names]</w:t>
+        <w:t>Yashvardhan Singroha</w:t>
         <w:br/>
       </w:r>
       <w:r>
@@ -54,7 +54,7 @@
         <w:t xml:space="preserve">Submission date  </w:t>
       </w:r>
       <w:r>
-        <w:t>9 October 2026</w:t>
+        <w:t>10 October 2026</w:t>
       </w:r>
     </w:p>
     <w:p>

</xml_diff>